<commit_message>
Refine design with Manrope and add project landing page
Apply the landing-page-design system to the app, slides and report,
add a case-study landing page with a plan hero, FAQ, tagline reveal and
mobile navigation, and refresh the report, slides and submission copies.
</commit_message>
<xml_diff>
--- a/report/Assignment5_Report.docx
+++ b/report/Assignment5_Report.docx
@@ -576,7 +576,7 @@
     <w:p>
       <w:r>
         <w:rPr>
-          <w:i/>
+          <w:i w:val="0"/>
           <w:color w:val="555555"/>
           <w:sz w:val="16"/>
         </w:rPr>
@@ -957,7 +957,7 @@
     <w:p>
       <w:r>
         <w:rPr>
-          <w:i/>
+          <w:i w:val="0"/>
           <w:color w:val="555555"/>
           <w:sz w:val="16"/>
         </w:rPr>
@@ -1016,7 +1016,7 @@
     <w:p>
       <w:r>
         <w:rPr>
-          <w:i/>
+          <w:i w:val="0"/>
           <w:color w:val="555555"/>
           <w:sz w:val="16"/>
         </w:rPr>
@@ -1067,7 +1067,7 @@
     <w:p>
       <w:r>
         <w:rPr>
-          <w:i/>
+          <w:i w:val="0"/>
           <w:color w:val="555555"/>
           <w:sz w:val="16"/>
         </w:rPr>
@@ -1118,7 +1118,7 @@
     <w:p>
       <w:r>
         <w:rPr>
-          <w:i/>
+          <w:i w:val="0"/>
           <w:color w:val="555555"/>
           <w:sz w:val="16"/>
         </w:rPr>
@@ -1169,7 +1169,7 @@
     <w:p>
       <w:r>
         <w:rPr>
-          <w:i/>
+          <w:i w:val="0"/>
           <w:color w:val="555555"/>
           <w:sz w:val="16"/>
         </w:rPr>
@@ -1457,7 +1457,7 @@
     <w:p>
       <w:r>
         <w:rPr>
-          <w:i/>
+          <w:i w:val="0"/>
           <w:color w:val="555555"/>
           <w:sz w:val="16"/>
         </w:rPr>
@@ -3962,7 +3962,7 @@
     <w:p>
       <w:r>
         <w:rPr>
-          <w:i/>
+          <w:i w:val="0"/>
           <w:color w:val="555555"/>
           <w:sz w:val="16"/>
         </w:rPr>
@@ -4331,7 +4331,7 @@
     <w:p>
       <w:r>
         <w:rPr>
-          <w:i/>
+          <w:i w:val="0"/>
           <w:color w:val="555555"/>
           <w:sz w:val="16"/>
         </w:rPr>
@@ -4382,7 +4382,7 @@
     <w:p>
       <w:r>
         <w:rPr>
-          <w:i/>
+          <w:i w:val="0"/>
           <w:color w:val="555555"/>
           <w:sz w:val="16"/>
         </w:rPr>
@@ -4661,7 +4661,7 @@
     <w:p>
       <w:r>
         <w:rPr>
-          <w:i/>
+          <w:i w:val="0"/>
           <w:color w:val="555555"/>
           <w:sz w:val="16"/>
         </w:rPr>
@@ -5158,7 +5158,7 @@
     <w:p>
       <w:r>
         <w:rPr>
-          <w:i/>
+          <w:i w:val="0"/>
           <w:color w:val="555555"/>
           <w:sz w:val="16"/>
         </w:rPr>
@@ -6554,7 +6554,7 @@
     <w:p>
       <w:r>
         <w:rPr>
-          <w:i/>
+          <w:i w:val="0"/>
           <w:color w:val="555555"/>
           <w:sz w:val="16"/>
         </w:rPr>
@@ -6600,7 +6600,7 @@
     <w:p>
       <w:r>
         <w:rPr>
-          <w:i/>
+          <w:i w:val="0"/>
           <w:color w:val="555555"/>
           <w:sz w:val="16"/>
         </w:rPr>
@@ -6669,7 +6669,7 @@
     <w:p>
       <w:r>
         <w:rPr>
-          <w:i/>
+          <w:i w:val="0"/>
           <w:color w:val="555555"/>
           <w:sz w:val="16"/>
         </w:rPr>
@@ -7563,7 +7563,7 @@
     <w:p>
       <w:r>
         <w:rPr>
-          <w:i/>
+          <w:i w:val="0"/>
           <w:color w:val="555555"/>
           <w:sz w:val="16"/>
         </w:rPr>
@@ -8186,7 +8186,7 @@
     <w:p>
       <w:r>
         <w:rPr>
-          <w:i/>
+          <w:i w:val="0"/>
           <w:color w:val="555555"/>
           <w:sz w:val="16"/>
         </w:rPr>
@@ -8232,7 +8232,7 @@
     <w:p>
       <w:r>
         <w:rPr>
-          <w:i/>
+          <w:i w:val="0"/>
           <w:color w:val="555555"/>
           <w:sz w:val="16"/>
         </w:rPr>
@@ -8601,7 +8601,7 @@
     <w:p>
       <w:r>
         <w:rPr>
-          <w:i/>
+          <w:i w:val="0"/>
           <w:color w:val="555555"/>
           <w:sz w:val="16"/>
         </w:rPr>
@@ -8957,7 +8957,7 @@
     <w:p>
       <w:r>
         <w:rPr>
-          <w:i/>
+          <w:i w:val="0"/>
           <w:color w:val="555555"/>
           <w:sz w:val="16"/>
         </w:rPr>
@@ -9526,7 +9526,7 @@
     <w:p>
       <w:r>
         <w:rPr>
-          <w:i/>
+          <w:i w:val="0"/>
           <w:color w:val="555555"/>
           <w:sz w:val="16"/>
         </w:rPr>
@@ -9960,7 +9960,7 @@
     <w:p>
       <w:r>
         <w:rPr>
-          <w:i/>
+          <w:i w:val="0"/>
           <w:color w:val="555555"/>
           <w:sz w:val="16"/>
         </w:rPr>
@@ -10383,7 +10383,7 @@
     <w:p>
       <w:r>
         <w:rPr>
-          <w:i/>
+          <w:i w:val="0"/>
           <w:color w:val="555555"/>
           <w:sz w:val="16"/>
         </w:rPr>
@@ -11676,7 +11676,7 @@
     <w:p>
       <w:r>
         <w:rPr>
-          <w:i/>
+          <w:i w:val="0"/>
           <w:color w:val="555555"/>
           <w:sz w:val="16"/>
         </w:rPr>
@@ -12961,7 +12961,7 @@
     <w:p>
       <w:r>
         <w:rPr>
-          <w:i/>
+          <w:i w:val="0"/>
           <w:color w:val="555555"/>
           <w:sz w:val="16"/>
         </w:rPr>
@@ -14246,7 +14246,7 @@
     <w:p>
       <w:r>
         <w:rPr>
-          <w:i/>
+          <w:i w:val="0"/>
           <w:color w:val="555555"/>
           <w:sz w:val="16"/>
         </w:rPr>
@@ -15401,7 +15401,7 @@
     <w:p>
       <w:r>
         <w:rPr>
-          <w:i/>
+          <w:i w:val="0"/>
           <w:color w:val="555555"/>
           <w:sz w:val="16"/>
         </w:rPr>
@@ -15733,7 +15733,7 @@
     <w:p>
       <w:r>
         <w:rPr>
-          <w:i/>
+          <w:i w:val="0"/>
           <w:color w:val="555555"/>
           <w:sz w:val="16"/>
         </w:rPr>

</xml_diff>

<commit_message>
Add team names, speaker script and Pages build
Add Laura Duisenova and Zhaidar Kairat to the deck, report and site,
add a per-speaker script with Q&A, and add the self contained Pages build.
</commit_message>
<xml_diff>
--- a/report/Assignment5_Report.docx
+++ b/report/Assignment5_Report.docx
@@ -53,7 +53,7 @@
           <w:color w:val="555555"/>
           <w:sz w:val="21"/>
         </w:rPr>
-        <w:t>Dinmukhammed Mynzhassar, AAI-2504M</w:t>
+        <w:t>Dinmukhammed Mynzhassar, Laura Duisenova, Zhaidar Kairat</w:t>
       </w:r>
     </w:p>
     <w:p>
@@ -62,7 +62,7 @@
           <w:color w:val="555555"/>
           <w:sz w:val="21"/>
         </w:rPr>
-        <w:t>Team members: ______________________________</w:t>
+        <w:t>AAI-2504M</w:t>
       </w:r>
     </w:p>
     <w:p>

</xml_diff>